<commit_message>
fix: calibrate_one 单文本逐条处理导致 DirectCalibration 全 0.5 — 改用 process() 批处理
根因:
1. Trigonometric Jaccard 在中文短原型短语上完全失效 — 字符三 gram
   无重叠 → 所有 raw scores 为 0 → DirectCalibration 退化 → 全 0.5
2. pyodide_handlers handle_calibrate 逐条调用 calibrate_one，
   每次仅 1 条文本 → 1 个 raw score → DirectCalibration min==max
   → 旧代码静默返回 0.5，新代码 raise ValueError

修复:
1. calibrator.py: _fallback_text_scores 废弃 trigram Jaccard，
   改用文本长度自归一化 len/(len+100) + 条件位置偏置，
   确保单条和多条文本都产生差异化分数
2. pyodide_handlers.py: handle_calibrate 将 for+calibrate_one
   改为单次 process() 批处理所有文本，避免单值校准退化
3. test_qca_core.py: 更新退化分支测试用例，改为断言 ValueError

Co-Authored-By: Claude Sonnet 4.6 <noreply@anthropic.com>
</commit_message>
<xml_diff>
--- a/qca_output/qca_report.docx
+++ b/qca_output/qca_report.docx
@@ -90,7 +90,66 @@
           <w:b w:val="0"/>
           <w:sz w:val="21"/>
         </w:rPr>
-        <w:t>未找到有效的解。</w:t>
+        <w:t>=     =   citizen_dissatisfaction =  QCA     =</w:t>
+      </w:r>
+    </w:p>
+    <w:p>
+      <w:r>
+        <w:rPr>
+          <w:rFonts w:ascii="SimSun" w:hAnsi="SimSun" w:eastAsia="SimSun"/>
+          <w:b w:val="0"/>
+          <w:sz w:val="21"/>
+        </w:rPr>
+        <w:t xml:space="preserve">          "citizen_dissatisfaction"                 </w:t>
+      </w:r>
+    </w:p>
+    <w:p>
+      <w:r>
+        <w:rPr>
+          <w:rFonts w:ascii="SimSun" w:hAnsi="SimSun" w:eastAsia="SimSun"/>
+          <w:b w:val="0"/>
+          <w:sz w:val="21"/>
+        </w:rPr>
+        <w:t xml:space="preserve">     一    negative_affect*strong_demand</w:t>
+      </w:r>
+    </w:p>
+    <w:p>
+      <w:r>
+        <w:rPr>
+          <w:rFonts w:ascii="SimSun" w:hAnsi="SimSun" w:eastAsia="SimSun"/>
+          <w:b w:val="0"/>
+          <w:sz w:val="21"/>
+        </w:rPr>
+      </w:r>
+    </w:p>
+    <w:p>
+      <w:r>
+        <w:rPr>
+          <w:rFonts w:ascii="SimSun" w:hAnsi="SimSun" w:eastAsia="SimSun"/>
+          <w:b w:val="0"/>
+          <w:sz w:val="21"/>
+        </w:rPr>
+        <w:t xml:space="preserve">       复杂解 =</w:t>
+      </w:r>
+    </w:p>
+    <w:p>
+      <w:r>
+        <w:rPr>
+          <w:rFonts w:ascii="SimSun" w:hAnsi="SimSun" w:eastAsia="SimSun"/>
+          <w:b w:val="0"/>
+          <w:sz w:val="21"/>
+        </w:rPr>
+        <w:t>=          0.000 = 偏低 =</w:t>
+      </w:r>
+    </w:p>
+    <w:p>
+      <w:r>
+        <w:rPr>
+          <w:rFonts w:ascii="SimSun" w:hAnsi="SimSun" w:eastAsia="SimSun"/>
+          <w:b w:val="0"/>
+          <w:sz w:val="21"/>
+        </w:rPr>
+        <w:t>=         0.000 = 较低 =</w:t>
       </w:r>
     </w:p>
     <w:p>
@@ -237,7 +296,7 @@
                 <w:b w:val="0"/>
                 <w:sz w:val="21"/>
               </w:rPr>
-              <w:t>2.5</w:t>
+              <w:t>3.5</w:t>
             </w:r>
           </w:p>
         </w:tc>
@@ -253,139 +312,7 @@
                 <w:b w:val="0"/>
                 <w:sz w:val="21"/>
               </w:rPr>
-              <w:t>0.200</w:t>
-            </w:r>
-          </w:p>
-        </w:tc>
-        <w:tc>
-          <w:tcPr>
-            <w:tcW w:type="dxa" w:w="2160"/>
-          </w:tcPr>
-          <w:p>
-            <w:r/>
-            <w:r>
-              <w:rPr>
-                <w:rFonts w:ascii="SimSun" w:hAnsi="SimSun" w:eastAsia="SimSun"/>
-                <w:b w:val="0"/>
-                <w:sz w:val="21"/>
-              </w:rPr>
-              <w:t>0</w:t>
-            </w:r>
-          </w:p>
-        </w:tc>
-      </w:tr>
-      <w:tr>
-        <w:tc>
-          <w:tcPr>
-            <w:tcW w:type="dxa" w:w="2160"/>
-          </w:tcPr>
-          <w:p>
-            <w:r/>
-            <w:r>
-              <w:rPr>
-                <w:rFonts w:ascii="SimSun" w:hAnsi="SimSun" w:eastAsia="SimSun"/>
-                <w:b w:val="0"/>
-                <w:sz w:val="21"/>
-              </w:rPr>
-              <w:t>~NEGATIVE_AFFECT*STRONG_DEMAND</w:t>
-            </w:r>
-          </w:p>
-        </w:tc>
-        <w:tc>
-          <w:tcPr>
-            <w:tcW w:type="dxa" w:w="2160"/>
-          </w:tcPr>
-          <w:p>
-            <w:r/>
-            <w:r>
-              <w:rPr>
-                <w:rFonts w:ascii="SimSun" w:hAnsi="SimSun" w:eastAsia="SimSun"/>
-                <w:b w:val="0"/>
-                <w:sz w:val="21"/>
-              </w:rPr>
-              <w:t>2.5</w:t>
-            </w:r>
-          </w:p>
-        </w:tc>
-        <w:tc>
-          <w:tcPr>
-            <w:tcW w:type="dxa" w:w="2160"/>
-          </w:tcPr>
-          <w:p>
-            <w:r/>
-            <w:r>
-              <w:rPr>
-                <w:rFonts w:ascii="SimSun" w:hAnsi="SimSun" w:eastAsia="SimSun"/>
-                <w:b w:val="0"/>
-                <w:sz w:val="21"/>
-              </w:rPr>
-              <w:t>0.200</w:t>
-            </w:r>
-          </w:p>
-        </w:tc>
-        <w:tc>
-          <w:tcPr>
-            <w:tcW w:type="dxa" w:w="2160"/>
-          </w:tcPr>
-          <w:p>
-            <w:r/>
-            <w:r>
-              <w:rPr>
-                <w:rFonts w:ascii="SimSun" w:hAnsi="SimSun" w:eastAsia="SimSun"/>
-                <w:b w:val="0"/>
-                <w:sz w:val="21"/>
-              </w:rPr>
-              <w:t>0</w:t>
-            </w:r>
-          </w:p>
-        </w:tc>
-      </w:tr>
-      <w:tr>
-        <w:tc>
-          <w:tcPr>
-            <w:tcW w:type="dxa" w:w="2160"/>
-          </w:tcPr>
-          <w:p>
-            <w:r/>
-            <w:r>
-              <w:rPr>
-                <w:rFonts w:ascii="SimSun" w:hAnsi="SimSun" w:eastAsia="SimSun"/>
-                <w:b w:val="0"/>
-                <w:sz w:val="21"/>
-              </w:rPr>
-              <w:t>NEGATIVE_AFFECT*~STRONG_DEMAND</w:t>
-            </w:r>
-          </w:p>
-        </w:tc>
-        <w:tc>
-          <w:tcPr>
-            <w:tcW w:type="dxa" w:w="2160"/>
-          </w:tcPr>
-          <w:p>
-            <w:r/>
-            <w:r>
-              <w:rPr>
-                <w:rFonts w:ascii="SimSun" w:hAnsi="SimSun" w:eastAsia="SimSun"/>
-                <w:b w:val="0"/>
-                <w:sz w:val="21"/>
-              </w:rPr>
-              <w:t>2.5</w:t>
-            </w:r>
-          </w:p>
-        </w:tc>
-        <w:tc>
-          <w:tcPr>
-            <w:tcW w:type="dxa" w:w="2160"/>
-          </w:tcPr>
-          <w:p>
-            <w:r/>
-            <w:r>
-              <w:rPr>
-                <w:rFonts w:ascii="SimSun" w:hAnsi="SimSun" w:eastAsia="SimSun"/>
-                <w:b w:val="0"/>
-                <w:sz w:val="21"/>
-              </w:rPr>
-              <w:t>0.200</w:t>
+              <w:t>0.141</w:t>
             </w:r>
           </w:p>
         </w:tc>
@@ -435,7 +362,7 @@
                 <w:b w:val="0"/>
                 <w:sz w:val="21"/>
               </w:rPr>
-              <w:t>2.5</w:t>
+              <w:t>1.5</w:t>
             </w:r>
           </w:p>
         </w:tc>
@@ -451,7 +378,7 @@
                 <w:b w:val="0"/>
                 <w:sz w:val="21"/>
               </w:rPr>
-              <w:t>0.200</w:t>
+              <w:t>1.000</w:t>
             </w:r>
           </w:p>
         </w:tc>
@@ -467,7 +394,7 @@
                 <w:b w:val="0"/>
                 <w:sz w:val="21"/>
               </w:rPr>
-              <w:t>0</w:t>
+              <w:t>1</w:t>
             </w:r>
           </w:p>
         </w:tc>
@@ -489,6 +416,203 @@
           <w:sz w:val="21"/>
         </w:rPr>
         <w:t xml:space="preserve">QCA  </w:t>
+      </w:r>
+    </w:p>
+    <w:p>
+      <w:pPr>
+        <w:pStyle w:val="Heading2"/>
+      </w:pPr>
+      <w:r>
+        <w:rPr>
+          <w:rFonts w:ascii="SimHei" w:hAnsi="SimHei" w:eastAsia="SimHei"/>
+          <w:b/>
+          <w:sz w:val="21"/>
+        </w:rPr>
+        <w:t>复杂解</w:t>
+      </w:r>
+    </w:p>
+    <w:p>
+      <w:r>
+        <w:rPr>
+          <w:rFonts w:ascii="SimSun" w:hAnsi="SimSun" w:eastAsia="SimSun"/>
+          <w:b w:val="0"/>
+          <w:sz w:val="21"/>
+        </w:rPr>
+        <w:t xml:space="preserve">    negative_affect*strong_demand</w:t>
+      </w:r>
+    </w:p>
+    <w:p>
+      <w:r>
+        <w:rPr>
+          <w:rFonts w:ascii="SimSun" w:hAnsi="SimSun" w:eastAsia="SimSun"/>
+          <w:b w:val="0"/>
+          <w:sz w:val="21"/>
+        </w:rPr>
+        <w:t xml:space="preserve">        0.000</w:t>
+      </w:r>
+    </w:p>
+    <w:p>
+      <w:r>
+        <w:rPr>
+          <w:rFonts w:ascii="SimSun" w:hAnsi="SimSun" w:eastAsia="SimSun"/>
+          <w:b w:val="0"/>
+          <w:sz w:val="21"/>
+        </w:rPr>
+        <w:t xml:space="preserve">        0.000</w:t>
+      </w:r>
+    </w:p>
+    <w:tbl>
+      <w:tblPr>
+        <w:tblStyle w:val="TableGrid"/>
+        <w:tblW w:type="auto" w:w="0"/>
+        <w:tblLook w:firstColumn="1" w:firstRow="1" w:lastColumn="0" w:lastRow="0" w:noHBand="0" w:noVBand="1" w:val="04A0"/>
+      </w:tblPr>
+      <w:tblGrid>
+        <w:gridCol w:w="2160"/>
+        <w:gridCol w:w="2160"/>
+        <w:gridCol w:w="2160"/>
+        <w:gridCol w:w="2160"/>
+      </w:tblGrid>
+      <w:tr>
+        <w:tc>
+          <w:tcPr>
+            <w:tcW w:type="dxa" w:w="2160"/>
+          </w:tcPr>
+          <w:p>
+            <w:r/>
+            <w:r>
+              <w:rPr>
+                <w:rFonts w:ascii="SimHei" w:hAnsi="SimHei" w:eastAsia="SimHei"/>
+                <w:b/>
+                <w:sz w:val="21"/>
+              </w:rPr>
+              <w:t xml:space="preserve">    </w:t>
+            </w:r>
+          </w:p>
+        </w:tc>
+        <w:tc>
+          <w:tcPr>
+            <w:tcW w:type="dxa" w:w="2160"/>
+          </w:tcPr>
+          <w:p>
+            <w:r/>
+            <w:r>
+              <w:rPr>
+                <w:rFonts w:ascii="SimHei" w:hAnsi="SimHei" w:eastAsia="SimHei"/>
+                <w:b/>
+                <w:sz w:val="21"/>
+              </w:rPr>
+              <w:t xml:space="preserve">    </w:t>
+            </w:r>
+          </w:p>
+        </w:tc>
+        <w:tc>
+          <w:tcPr>
+            <w:tcW w:type="dxa" w:w="2160"/>
+          </w:tcPr>
+          <w:p>
+            <w:r/>
+            <w:r>
+              <w:rPr>
+                <w:rFonts w:ascii="SimHei" w:hAnsi="SimHei" w:eastAsia="SimHei"/>
+                <w:b/>
+                <w:sz w:val="21"/>
+              </w:rPr>
+              <w:t xml:space="preserve">    </w:t>
+            </w:r>
+          </w:p>
+        </w:tc>
+        <w:tc>
+          <w:tcPr>
+            <w:tcW w:type="dxa" w:w="2160"/>
+          </w:tcPr>
+          <w:p>
+            <w:r/>
+            <w:r>
+              <w:rPr>
+                <w:rFonts w:ascii="SimHei" w:hAnsi="SimHei" w:eastAsia="SimHei"/>
+                <w:b/>
+                <w:sz w:val="21"/>
+              </w:rPr>
+              <w:t xml:space="preserve">    </w:t>
+            </w:r>
+          </w:p>
+        </w:tc>
+      </w:tr>
+      <w:tr>
+        <w:tc>
+          <w:tcPr>
+            <w:tcW w:type="dxa" w:w="2160"/>
+          </w:tcPr>
+          <w:p>
+            <w:r/>
+            <w:r>
+              <w:rPr>
+                <w:rFonts w:ascii="SimSun" w:hAnsi="SimSun" w:eastAsia="SimSun"/>
+                <w:b w:val="0"/>
+                <w:sz w:val="21"/>
+              </w:rPr>
+              <w:t>negative_affect*strong_demand</w:t>
+            </w:r>
+          </w:p>
+        </w:tc>
+        <w:tc>
+          <w:tcPr>
+            <w:tcW w:type="dxa" w:w="2160"/>
+          </w:tcPr>
+          <w:p>
+            <w:r/>
+            <w:r>
+              <w:rPr>
+                <w:rFonts w:ascii="SimSun" w:hAnsi="SimSun" w:eastAsia="SimSun"/>
+                <w:b w:val="0"/>
+                <w:sz w:val="21"/>
+              </w:rPr>
+              <w:t>0.000</w:t>
+            </w:r>
+          </w:p>
+        </w:tc>
+        <w:tc>
+          <w:tcPr>
+            <w:tcW w:type="dxa" w:w="2160"/>
+          </w:tcPr>
+          <w:p>
+            <w:r/>
+            <w:r>
+              <w:rPr>
+                <w:rFonts w:ascii="SimSun" w:hAnsi="SimSun" w:eastAsia="SimSun"/>
+                <w:b w:val="0"/>
+                <w:sz w:val="21"/>
+              </w:rPr>
+              <w:t>0.000</w:t>
+            </w:r>
+          </w:p>
+        </w:tc>
+        <w:tc>
+          <w:tcPr>
+            <w:tcW w:type="dxa" w:w="2160"/>
+          </w:tcPr>
+          <w:p>
+            <w:r/>
+            <w:r>
+              <w:rPr>
+                <w:rFonts w:ascii="SimSun" w:hAnsi="SimSun" w:eastAsia="SimSun"/>
+                <w:b w:val="0"/>
+                <w:sz w:val="21"/>
+              </w:rPr>
+              <w:t>0.000</w:t>
+            </w:r>
+          </w:p>
+        </w:tc>
+      </w:tr>
+    </w:tbl>
+    <w:p>
+      <w:r>
+        <w:rPr>
+          <w:rFonts w:ascii="SimSun" w:hAnsi="SimSun" w:eastAsia="SimSun"/>
+          <w:b w:val="0"/>
+          <w:sz w:val="21"/>
+        </w:rPr>
       </w:r>
     </w:p>
     <w:p>
@@ -635,7 +759,7 @@
                 <w:b w:val="0"/>
                 <w:sz w:val="21"/>
               </w:rPr>
-              <w:t>0.500</w:t>
+              <w:t>1.000</w:t>
             </w:r>
           </w:p>
         </w:tc>
@@ -651,7 +775,7 @@
                 <w:b w:val="0"/>
                 <w:sz w:val="21"/>
               </w:rPr>
-              <w:t>0.200</w:t>
+              <w:t>1.000</w:t>
             </w:r>
           </w:p>
         </w:tc>
@@ -667,7 +791,7 @@
                 <w:b w:val="0"/>
                 <w:sz w:val="21"/>
               </w:rPr>
-              <w:t>否</w:t>
+              <w:t>是</w:t>
             </w:r>
           </w:p>
         </w:tc>
@@ -701,7 +825,7 @@
                 <w:b w:val="0"/>
                 <w:sz w:val="21"/>
               </w:rPr>
-              <w:t>0.500</w:t>
+              <w:t>1.000</w:t>
             </w:r>
           </w:p>
         </w:tc>
@@ -717,7 +841,7 @@
                 <w:b w:val="0"/>
                 <w:sz w:val="21"/>
               </w:rPr>
-              <w:t>0.200</w:t>
+              <w:t>1.000</w:t>
             </w:r>
           </w:p>
         </w:tc>
@@ -733,7 +857,7 @@
                 <w:b w:val="0"/>
                 <w:sz w:val="21"/>
               </w:rPr>
-              <w:t>否</w:t>
+              <w:t>是</w:t>
             </w:r>
           </w:p>
         </w:tc>
@@ -767,7 +891,7 @@
                 <w:b w:val="0"/>
                 <w:sz w:val="21"/>
               </w:rPr>
-              <w:t>0.500</w:t>
+              <w:t>0.327</w:t>
             </w:r>
           </w:p>
         </w:tc>
@@ -783,7 +907,7 @@
                 <w:b w:val="0"/>
                 <w:sz w:val="21"/>
               </w:rPr>
-              <w:t>0.200</w:t>
+              <w:t>0.141</w:t>
             </w:r>
           </w:p>
         </w:tc>
@@ -833,7 +957,7 @@
                 <w:b w:val="0"/>
                 <w:sz w:val="21"/>
               </w:rPr>
-              <w:t>0.500</w:t>
+              <w:t>0.327</w:t>
             </w:r>
           </w:p>
         </w:tc>
@@ -849,7 +973,7 @@
                 <w:b w:val="0"/>
                 <w:sz w:val="21"/>
               </w:rPr>
-              <w:t>0.200</w:t>
+              <w:t>0.141</w:t>
             </w:r>
           </w:p>
         </w:tc>
@@ -896,7 +1020,7 @@
           <w:b w:val="0"/>
           <w:sz w:val="21"/>
         </w:rPr>
-        <w:t xml:space="preserve">      1.00</w:t>
+        <w:t xml:space="preserve">      0.88</w:t>
       </w:r>
     </w:p>
     <w:p>
@@ -1107,7 +1231,7 @@
                 <w:b w:val="0"/>
                 <w:sz w:val="21"/>
               </w:rPr>
-              <w:t>1.000-1.000</w:t>
+              <w:t>0.000-1.000</w:t>
             </w:r>
           </w:p>
         </w:tc>
@@ -1123,7 +1247,7 @@
                 <w:b w:val="0"/>
                 <w:sz w:val="21"/>
               </w:rPr>
-              <w:t>通过</w:t>
+              <w:t>失败</w:t>
             </w:r>
           </w:p>
         </w:tc>
@@ -1239,7 +1363,7 @@
                 <w:b w:val="0"/>
                 <w:sz w:val="21"/>
               </w:rPr>
-              <w:t>1.000-1.000</w:t>
+              <w:t>1.000-0.000</w:t>
             </w:r>
           </w:p>
         </w:tc>

</xml_diff>

<commit_message>
docs: 更新 handover — 记录 Transformers.js 云端推理崩溃修复 (bug-393)
Co-Authored-By: Claude Sonnet 4.6 <noreply@anthropic.com>
</commit_message>
<xml_diff>
--- a/qca_output/qca_report.docx
+++ b/qca_output/qca_report.docx
@@ -23,7 +23,7 @@
           <w:b w:val="0"/>
           <w:sz w:val="21"/>
         </w:rPr>
-        <w:t xml:space="preserve">    2026-05-27</w:t>
+        <w:t xml:space="preserve">    2026-05-28</w:t>
       </w:r>
     </w:p>
     <w:p>
@@ -312,7 +312,7 @@
                 <w:b w:val="0"/>
                 <w:sz w:val="21"/>
               </w:rPr>
-              <w:t>0.143</w:t>
+              <w:t>0.124</w:t>
             </w:r>
           </w:p>
         </w:tc>
@@ -362,7 +362,7 @@
                 <w:b w:val="0"/>
                 <w:sz w:val="21"/>
               </w:rPr>
-              <w:t>1.5</w:t>
+              <w:t>1.3</w:t>
             </w:r>
           </w:p>
         </w:tc>
@@ -759,7 +759,7 @@
                 <w:b w:val="0"/>
                 <w:sz w:val="21"/>
               </w:rPr>
-              <w:t>1.000</w:t>
+              <w:t>0.937</w:t>
             </w:r>
           </w:p>
         </w:tc>
@@ -841,7 +841,7 @@
                 <w:b w:val="0"/>
                 <w:sz w:val="21"/>
               </w:rPr>
-              <w:t>1.000</w:t>
+              <w:t>0.984</w:t>
             </w:r>
           </w:p>
         </w:tc>
@@ -891,7 +891,7 @@
                 <w:b w:val="0"/>
                 <w:sz w:val="21"/>
               </w:rPr>
-              <w:t>0.333</w:t>
+              <w:t>0.304</w:t>
             </w:r>
           </w:p>
         </w:tc>
@@ -907,7 +907,7 @@
                 <w:b w:val="0"/>
                 <w:sz w:val="21"/>
               </w:rPr>
-              <w:t>0.143</w:t>
+              <w:t>0.120</w:t>
             </w:r>
           </w:p>
         </w:tc>
@@ -957,7 +957,7 @@
                 <w:b w:val="0"/>
                 <w:sz w:val="21"/>
               </w:rPr>
-              <w:t>0.333</w:t>
+              <w:t>0.304</w:t>
             </w:r>
           </w:p>
         </w:tc>
@@ -973,7 +973,7 @@
                 <w:b w:val="0"/>
                 <w:sz w:val="21"/>
               </w:rPr>
-              <w:t>0.143</w:t>
+              <w:t>0.124</w:t>
             </w:r>
           </w:p>
         </w:tc>
@@ -1020,7 +1020,7 @@
           <w:b w:val="0"/>
           <w:sz w:val="21"/>
         </w:rPr>
-        <w:t xml:space="preserve">      0.77</w:t>
+        <w:t xml:space="preserve">      0.85</w:t>
       </w:r>
     </w:p>
     <w:p>
@@ -1030,7 +1030,7 @@
           <w:b w:val="0"/>
           <w:sz w:val="21"/>
         </w:rPr>
-        <w:t>Moderate robustness — some sensitivity observed, interpret with caution.</w:t>
+        <w:t>High robustness — QCA solution is stable under sensitivity tests.</w:t>
       </w:r>
     </w:p>
     <w:p>

</xml_diff>

<commit_message>
fix: robustness 一直显示 N/A — DataInput.tsx 调用 runFullPipeline 缺 runRobustness: true
Root cause: DataInput.tsx 的 runFullPipeline 调用未传入 runRobustness: true，
导致稳健性步骤被静默跳过，结果页面始终显示 N/A。

Co-Authored-By: Claude Sonnet 4.6 <noreply@anthropic.com>
</commit_message>
<xml_diff>
--- a/qca_output/qca_report.docx
+++ b/qca_output/qca_report.docx
@@ -139,7 +139,7 @@
           <w:b w:val="0"/>
           <w:sz w:val="21"/>
         </w:rPr>
-        <w:t>=          0.000 = 偏低 =</w:t>
+        <w:t>=          1.000 = 非常高 =</w:t>
       </w:r>
     </w:p>
     <w:p>
@@ -149,7 +149,7 @@
           <w:b w:val="0"/>
           <w:sz w:val="21"/>
         </w:rPr>
-        <w:t>=         0.000 = 较低 =</w:t>
+        <w:t>=         0.937 = 很高 =</w:t>
       </w:r>
     </w:p>
     <w:p>
@@ -448,7 +448,7 @@
           <w:b w:val="0"/>
           <w:sz w:val="21"/>
         </w:rPr>
-        <w:t xml:space="preserve">        0.000</w:t>
+        <w:t xml:space="preserve">        1.000</w:t>
       </w:r>
     </w:p>
     <w:p>
@@ -458,7 +458,7 @@
           <w:b w:val="0"/>
           <w:sz w:val="21"/>
         </w:rPr>
-        <w:t xml:space="preserve">        0.000</w:t>
+        <w:t xml:space="preserve">        0.937</w:t>
       </w:r>
     </w:p>
     <w:tbl>
@@ -568,7 +568,7 @@
                 <w:b w:val="0"/>
                 <w:sz w:val="21"/>
               </w:rPr>
-              <w:t>0.000</w:t>
+              <w:t>1.000</w:t>
             </w:r>
           </w:p>
         </w:tc>
@@ -584,7 +584,7 @@
                 <w:b w:val="0"/>
                 <w:sz w:val="21"/>
               </w:rPr>
-              <w:t>0.000</w:t>
+              <w:t>0.937</w:t>
             </w:r>
           </w:p>
         </w:tc>
@@ -600,7 +600,7 @@
                 <w:b w:val="0"/>
                 <w:sz w:val="21"/>
               </w:rPr>
-              <w:t>0.000</w:t>
+              <w:t>0.937</w:t>
             </w:r>
           </w:p>
         </w:tc>

</xml_diff>

<commit_message>
Revert "fix: robustness 一直显示 N/A — DataInput.tsx 调用 runFullPipeline 缺 runRobustness: true"
This reverts commit d15e1446d68df70ca56d33099325588242561a87.
</commit_message>
<xml_diff>
--- a/qca_output/qca_report.docx
+++ b/qca_output/qca_report.docx
@@ -139,7 +139,7 @@
           <w:b w:val="0"/>
           <w:sz w:val="21"/>
         </w:rPr>
-        <w:t>=          1.000 = 非常高 =</w:t>
+        <w:t>=          0.000 = 偏低 =</w:t>
       </w:r>
     </w:p>
     <w:p>
@@ -149,7 +149,7 @@
           <w:b w:val="0"/>
           <w:sz w:val="21"/>
         </w:rPr>
-        <w:t>=         0.937 = 很高 =</w:t>
+        <w:t>=         0.000 = 较低 =</w:t>
       </w:r>
     </w:p>
     <w:p>
@@ -448,7 +448,7 @@
           <w:b w:val="0"/>
           <w:sz w:val="21"/>
         </w:rPr>
-        <w:t xml:space="preserve">        1.000</w:t>
+        <w:t xml:space="preserve">        0.000</w:t>
       </w:r>
     </w:p>
     <w:p>
@@ -458,7 +458,7 @@
           <w:b w:val="0"/>
           <w:sz w:val="21"/>
         </w:rPr>
-        <w:t xml:space="preserve">        0.937</w:t>
+        <w:t xml:space="preserve">        0.000</w:t>
       </w:r>
     </w:p>
     <w:tbl>
@@ -568,7 +568,7 @@
                 <w:b w:val="0"/>
                 <w:sz w:val="21"/>
               </w:rPr>
-              <w:t>1.000</w:t>
+              <w:t>0.000</w:t>
             </w:r>
           </w:p>
         </w:tc>
@@ -584,7 +584,7 @@
                 <w:b w:val="0"/>
                 <w:sz w:val="21"/>
               </w:rPr>
-              <w:t>0.937</w:t>
+              <w:t>0.000</w:t>
             </w:r>
           </w:p>
         </w:tc>
@@ -600,7 +600,7 @@
                 <w:b w:val="0"/>
                 <w:sz w:val="21"/>
               </w:rPr>
-              <w:t>0.937</w:t>
+              <w:t>0.000</w:t>
             </w:r>
           </w:p>
         </w:tc>

</xml_diff>